<commit_message>
Report SSIM beside PSNR in both papers
Table I gets an SSIM column (Wang et al. 2004, new reference) and the
results text says what it shows: the same ranking as PSNR, the quality
model above BM3D, the speed model level with it on Set12, maxout above
ReLU on all 80 images, and DnCNN-S slightly above our quality model in
SSIM. The Korean draft also notes that BM3D is relatively stronger in
SSIM. "SSIM not reported" leaves both limitation lists.

To stay at four pages the English paper drops the reading guide from
the Fig. 2 caption, the core times from the Table II caption and a
repeated 1.01x clause. build_docx.py takes column widths from the
dash counts of a table's separator row when they differ, so Table I's
seven columns and Table II's headers fit on one line each.

Co-Authored-By: Claude Opus 5.5 <noreply@anthropic.com>
Claude-Session: https://claude.ai/code/session_01KmQd2ww7ZkypMsRjhWuU5X
</commit_message>
<xml_diff>
--- a/iweict2026/PAPER_EN.docx
+++ b/iweict2026/PAPER_EN.docx
@@ -355,7 +355,7 @@
         <w:t>Setup.</w:t>
       </w:r>
       <w:r>
-        <w:t xml:space="preserve"> Set12 and BSD68 [22] at σ = 25, with the same noise for every method, clipped and quantized to 7 bits. This input is the CNNs' training distribution but not BM3D's: on unclipped noise BM3D gains 0.03 / 0.26 dB (Set12 / BSD68), and tuning its σ changes it by under 0.1 dB, so Table I lists both. As a CNN reference on the same input we evaluate the public DnCNN-S weights [1] (float, trained on unclipped noise). Integer PSNR is that of the integer model, which the board reproduces bit for bit; with one training seed, differences under 0.1 dB are not interpreted.</w:t>
+        <w:t xml:space="preserve"> Set12 and BSD68 [22] at σ = 25, with the same noise for every method, clipped and quantized to 7 bits. This input is the CNNs' training distribution but not BM3D's: on unclipped noise BM3D gains 0.03 / 0.26 dB (Set12 / BSD68), and tuning its σ changes it by under 0.1 dB, so Table I lists both. As a CNN reference on the same input we evaluate the public DnCNN-S weights [1] (float, trained on unclipped noise). SSIM [23] ranks our integer models as PSNR does. Integer PSNR is that of the integer model, which the board reproduces bit for bit; with one training seed, differences under 0.1 dB are not interpreted.</w:t>
       </w:r>
     </w:p>
     <w:p>
@@ -379,7 +379,7 @@
         </w:numPr>
       </w:pPr>
       <w:r>
-        <w:t>Table I. Mean PSNR (dB) and core cost. Cycles are the corrected model; "board" marks networks whose cycles were measured. B-32 rows train for a fixed 120 epochs (seed 1).</w:t>
+        <w:t>Table I. Mean PSNR (dB), SSIM of the 8-bit output and core cost. Cycles are the corrected model; "board" marks networks whose cycles were measured. B-32 rows train for a fixed 120 epochs (seed 1).</w:t>
       </w:r>
     </w:p>
     <w:tbl>
@@ -394,17 +394,18 @@
         <w:tblLook w:firstColumn="1" w:firstRow="1" w:lastColumn="0" w:lastRow="0" w:noHBand="0" w:noVBand="1" w:val="04A0"/>
       </w:tblPr>
       <w:tblGrid>
-        <w:gridCol w:w="3277"/>
-        <w:gridCol w:w="1272"/>
-        <w:gridCol w:w="1272"/>
-        <w:gridCol w:w="1272"/>
-        <w:gridCol w:w="1272"/>
-        <w:gridCol w:w="1272"/>
+        <w:gridCol w:w="2551"/>
+        <w:gridCol w:w="1077"/>
+        <w:gridCol w:w="680"/>
+        <w:gridCol w:w="850"/>
+        <w:gridCol w:w="1417"/>
+        <w:gridCol w:w="1417"/>
+        <w:gridCol w:w="1644"/>
       </w:tblGrid>
       <w:tr>
         <w:tc>
           <w:tcPr>
-            <w:tcW w:type="dxa" w:w="3277"/>
+            <w:tcW w:type="dxa" w:w="2551"/>
           </w:tcPr>
           <w:p>
             <w:pPr>
@@ -418,7 +419,7 @@
         </w:tc>
         <w:tc>
           <w:tcPr>
-            <w:tcW w:type="dxa" w:w="1272"/>
+            <w:tcW w:type="dxa" w:w="1077"/>
           </w:tcPr>
           <w:p>
             <w:pPr>
@@ -433,7 +434,7 @@
         </w:tc>
         <w:tc>
           <w:tcPr>
-            <w:tcW w:type="dxa" w:w="1272"/>
+            <w:tcW w:type="dxa" w:w="680"/>
           </w:tcPr>
           <w:p>
             <w:pPr>
@@ -448,7 +449,7 @@
         </w:tc>
         <w:tc>
           <w:tcPr>
-            <w:tcW w:type="dxa" w:w="1272"/>
+            <w:tcW w:type="dxa" w:w="850"/>
           </w:tcPr>
           <w:p>
             <w:pPr>
@@ -463,7 +464,7 @@
         </w:tc>
         <w:tc>
           <w:tcPr>
-            <w:tcW w:type="dxa" w:w="1272"/>
+            <w:tcW w:type="dxa" w:w="1417"/>
           </w:tcPr>
           <w:p>
             <w:pPr>
@@ -478,7 +479,7 @@
         </w:tc>
         <w:tc>
           <w:tcPr>
-            <w:tcW w:type="dxa" w:w="1272"/>
+            <w:tcW w:type="dxa" w:w="1417"/>
           </w:tcPr>
           <w:p>
             <w:pPr>
@@ -488,6 +489,21 @@
             </w:pPr>
             <w:r>
               <w:t>BSD68 float / int</w:t>
+            </w:r>
+          </w:p>
+        </w:tc>
+        <w:tc>
+          <w:tcPr>
+            <w:tcW w:type="dxa" w:w="1644"/>
+          </w:tcPr>
+          <w:p>
+            <w:pPr>
+              <w:pStyle w:val="tablecolhead"/>
+              <w:spacing w:before="20" w:after="20"/>
+              <w:jc w:val="center"/>
+            </w:pPr>
+            <w:r>
+              <w:t>SSIM Set12 / BSD68</w:t>
             </w:r>
           </w:p>
         </w:tc>
@@ -495,7 +511,7 @@
       <w:tr>
         <w:tc>
           <w:tcPr>
-            <w:tcW w:type="dxa" w:w="3277"/>
+            <w:tcW w:type="dxa" w:w="2551"/>
           </w:tcPr>
           <w:p>
             <w:pPr>
@@ -509,7 +525,7 @@
         </w:tc>
         <w:tc>
           <w:tcPr>
-            <w:tcW w:type="dxa" w:w="1272"/>
+            <w:tcW w:type="dxa" w:w="1077"/>
           </w:tcPr>
           <w:p>
             <w:pPr>
@@ -524,7 +540,7 @@
         </w:tc>
         <w:tc>
           <w:tcPr>
-            <w:tcW w:type="dxa" w:w="1272"/>
+            <w:tcW w:type="dxa" w:w="680"/>
           </w:tcPr>
           <w:p>
             <w:pPr>
@@ -539,7 +555,7 @@
         </w:tc>
         <w:tc>
           <w:tcPr>
-            <w:tcW w:type="dxa" w:w="1272"/>
+            <w:tcW w:type="dxa" w:w="850"/>
           </w:tcPr>
           <w:p>
             <w:pPr>
@@ -554,7 +570,7 @@
         </w:tc>
         <w:tc>
           <w:tcPr>
-            <w:tcW w:type="dxa" w:w="1272"/>
+            <w:tcW w:type="dxa" w:w="1417"/>
           </w:tcPr>
           <w:p>
             <w:pPr>
@@ -569,7 +585,7 @@
         </w:tc>
         <w:tc>
           <w:tcPr>
-            <w:tcW w:type="dxa" w:w="1272"/>
+            <w:tcW w:type="dxa" w:w="1417"/>
           </w:tcPr>
           <w:p>
             <w:pPr>
@@ -579,6 +595,21 @@
             </w:pPr>
             <w:r>
               <w:t>28.37</w:t>
+            </w:r>
+          </w:p>
+        </w:tc>
+        <w:tc>
+          <w:tcPr>
+            <w:tcW w:type="dxa" w:w="1644"/>
+          </w:tcPr>
+          <w:p>
+            <w:pPr>
+              <w:pStyle w:val="tablecopy"/>
+              <w:spacing w:before="20" w:after="20"/>
+              <w:jc w:val="center"/>
+            </w:pPr>
+            <w:r>
+              <w:t>0.850 / 0.799</w:t>
             </w:r>
           </w:p>
         </w:tc>
@@ -586,7 +617,7 @@
       <w:tr>
         <w:tc>
           <w:tcPr>
-            <w:tcW w:type="dxa" w:w="3277"/>
+            <w:tcW w:type="dxa" w:w="2551"/>
           </w:tcPr>
           <w:p>
             <w:pPr>
@@ -600,7 +631,7 @@
         </w:tc>
         <w:tc>
           <w:tcPr>
-            <w:tcW w:type="dxa" w:w="1272"/>
+            <w:tcW w:type="dxa" w:w="1077"/>
           </w:tcPr>
           <w:p>
             <w:pPr>
@@ -615,7 +646,7 @@
         </w:tc>
         <w:tc>
           <w:tcPr>
-            <w:tcW w:type="dxa" w:w="1272"/>
+            <w:tcW w:type="dxa" w:w="680"/>
           </w:tcPr>
           <w:p>
             <w:pPr>
@@ -630,7 +661,7 @@
         </w:tc>
         <w:tc>
           <w:tcPr>
-            <w:tcW w:type="dxa" w:w="1272"/>
+            <w:tcW w:type="dxa" w:w="850"/>
           </w:tcPr>
           <w:p>
             <w:pPr>
@@ -645,7 +676,7 @@
         </w:tc>
         <w:tc>
           <w:tcPr>
-            <w:tcW w:type="dxa" w:w="1272"/>
+            <w:tcW w:type="dxa" w:w="1417"/>
           </w:tcPr>
           <w:p>
             <w:pPr>
@@ -660,7 +691,7 @@
         </w:tc>
         <w:tc>
           <w:tcPr>
-            <w:tcW w:type="dxa" w:w="1272"/>
+            <w:tcW w:type="dxa" w:w="1417"/>
           </w:tcPr>
           <w:p>
             <w:pPr>
@@ -670,6 +701,21 @@
             </w:pPr>
             <w:r>
               <w:t>28.62</w:t>
+            </w:r>
+          </w:p>
+        </w:tc>
+        <w:tc>
+          <w:tcPr>
+            <w:tcW w:type="dxa" w:w="1644"/>
+          </w:tcPr>
+          <w:p>
+            <w:pPr>
+              <w:pStyle w:val="tablecopy"/>
+              <w:spacing w:before="20" w:after="20"/>
+              <w:jc w:val="center"/>
+            </w:pPr>
+            <w:r>
+              <w:t>0.851 / 0.804</w:t>
             </w:r>
           </w:p>
         </w:tc>
@@ -677,7 +723,7 @@
       <w:tr>
         <w:tc>
           <w:tcPr>
-            <w:tcW w:type="dxa" w:w="3277"/>
+            <w:tcW w:type="dxa" w:w="2551"/>
           </w:tcPr>
           <w:p>
             <w:pPr>
@@ -691,7 +737,7 @@
         </w:tc>
         <w:tc>
           <w:tcPr>
-            <w:tcW w:type="dxa" w:w="1272"/>
+            <w:tcW w:type="dxa" w:w="1077"/>
           </w:tcPr>
           <w:p>
             <w:pPr>
@@ -706,7 +752,7 @@
         </w:tc>
         <w:tc>
           <w:tcPr>
-            <w:tcW w:type="dxa" w:w="1272"/>
+            <w:tcW w:type="dxa" w:w="680"/>
           </w:tcPr>
           <w:p>
             <w:pPr>
@@ -721,7 +767,7 @@
         </w:tc>
         <w:tc>
           <w:tcPr>
-            <w:tcW w:type="dxa" w:w="1272"/>
+            <w:tcW w:type="dxa" w:w="850"/>
           </w:tcPr>
           <w:p>
             <w:pPr>
@@ -736,7 +782,7 @@
         </w:tc>
         <w:tc>
           <w:tcPr>
-            <w:tcW w:type="dxa" w:w="1272"/>
+            <w:tcW w:type="dxa" w:w="1417"/>
           </w:tcPr>
           <w:p>
             <w:pPr>
@@ -751,7 +797,7 @@
         </w:tc>
         <w:tc>
           <w:tcPr>
-            <w:tcW w:type="dxa" w:w="1272"/>
+            <w:tcW w:type="dxa" w:w="1417"/>
           </w:tcPr>
           <w:p>
             <w:pPr>
@@ -761,6 +807,21 @@
             </w:pPr>
             <w:r>
               <w:t>28.89</w:t>
+            </w:r>
+          </w:p>
+        </w:tc>
+        <w:tc>
+          <w:tcPr>
+            <w:tcW w:type="dxa" w:w="1644"/>
+          </w:tcPr>
+          <w:p>
+            <w:pPr>
+              <w:pStyle w:val="tablecopy"/>
+              <w:spacing w:before="20" w:after="20"/>
+              <w:jc w:val="center"/>
+            </w:pPr>
+            <w:r>
+              <w:t>0.859 / 0.822</w:t>
             </w:r>
           </w:p>
         </w:tc>
@@ -768,7 +829,7 @@
       <w:tr>
         <w:tc>
           <w:tcPr>
-            <w:tcW w:type="dxa" w:w="3277"/>
+            <w:tcW w:type="dxa" w:w="2551"/>
           </w:tcPr>
           <w:p>
             <w:pPr>
@@ -782,7 +843,7 @@
         </w:tc>
         <w:tc>
           <w:tcPr>
-            <w:tcW w:type="dxa" w:w="1272"/>
+            <w:tcW w:type="dxa" w:w="1077"/>
           </w:tcPr>
           <w:p>
             <w:pPr>
@@ -797,7 +858,7 @@
         </w:tc>
         <w:tc>
           <w:tcPr>
-            <w:tcW w:type="dxa" w:w="1272"/>
+            <w:tcW w:type="dxa" w:w="680"/>
           </w:tcPr>
           <w:p>
             <w:pPr>
@@ -812,7 +873,7 @@
         </w:tc>
         <w:tc>
           <w:tcPr>
-            <w:tcW w:type="dxa" w:w="1272"/>
+            <w:tcW w:type="dxa" w:w="850"/>
           </w:tcPr>
           <w:p>
             <w:pPr>
@@ -827,7 +888,7 @@
         </w:tc>
         <w:tc>
           <w:tcPr>
-            <w:tcW w:type="dxa" w:w="1272"/>
+            <w:tcW w:type="dxa" w:w="1417"/>
           </w:tcPr>
           <w:p>
             <w:pPr>
@@ -842,7 +903,7 @@
         </w:tc>
         <w:tc>
           <w:tcPr>
-            <w:tcW w:type="dxa" w:w="1272"/>
+            <w:tcW w:type="dxa" w:w="1417"/>
           </w:tcPr>
           <w:p>
             <w:pPr>
@@ -852,6 +913,21 @@
             </w:pPr>
             <w:r>
               <w:t>28.83 / 28.80</w:t>
+            </w:r>
+          </w:p>
+        </w:tc>
+        <w:tc>
+          <w:tcPr>
+            <w:tcW w:type="dxa" w:w="1644"/>
+          </w:tcPr>
+          <w:p>
+            <w:pPr>
+              <w:pStyle w:val="tablecopy"/>
+              <w:spacing w:before="20" w:after="20"/>
+              <w:jc w:val="center"/>
+            </w:pPr>
+            <w:r>
+              <w:t>0.842 / 0.809</w:t>
             </w:r>
           </w:p>
         </w:tc>
@@ -859,7 +935,7 @@
       <w:tr>
         <w:tc>
           <w:tcPr>
-            <w:tcW w:type="dxa" w:w="3277"/>
+            <w:tcW w:type="dxa" w:w="2551"/>
           </w:tcPr>
           <w:p>
             <w:pPr>
@@ -876,7 +952,7 @@
         </w:tc>
         <w:tc>
           <w:tcPr>
-            <w:tcW w:type="dxa" w:w="1272"/>
+            <w:tcW w:type="dxa" w:w="1077"/>
           </w:tcPr>
           <w:p>
             <w:pPr>
@@ -891,7 +967,7 @@
         </w:tc>
         <w:tc>
           <w:tcPr>
-            <w:tcW w:type="dxa" w:w="1272"/>
+            <w:tcW w:type="dxa" w:w="680"/>
           </w:tcPr>
           <w:p>
             <w:pPr>
@@ -906,7 +982,7 @@
         </w:tc>
         <w:tc>
           <w:tcPr>
-            <w:tcW w:type="dxa" w:w="1272"/>
+            <w:tcW w:type="dxa" w:w="850"/>
           </w:tcPr>
           <w:p>
             <w:pPr>
@@ -921,7 +997,7 @@
         </w:tc>
         <w:tc>
           <w:tcPr>
-            <w:tcW w:type="dxa" w:w="1272"/>
+            <w:tcW w:type="dxa" w:w="1417"/>
           </w:tcPr>
           <w:p>
             <w:pPr>
@@ -942,7 +1018,7 @@
         </w:tc>
         <w:tc>
           <w:tcPr>
-            <w:tcW w:type="dxa" w:w="1272"/>
+            <w:tcW w:type="dxa" w:w="1417"/>
           </w:tcPr>
           <w:p>
             <w:pPr>
@@ -961,11 +1037,38 @@
             </w:r>
           </w:p>
         </w:tc>
+        <w:tc>
+          <w:tcPr>
+            <w:tcW w:type="dxa" w:w="1644"/>
+          </w:tcPr>
+          <w:p>
+            <w:pPr>
+              <w:pStyle w:val="tablecopy"/>
+              <w:spacing w:before="20" w:after="20"/>
+              <w:jc w:val="center"/>
+            </w:pPr>
+            <w:r>
+              <w:rPr>
+                <w:b/>
+              </w:rPr>
+              <w:t>0.855</w:t>
+            </w:r>
+            <w:r>
+              <w:t xml:space="preserve"> / </w:t>
+            </w:r>
+            <w:r>
+              <w:rPr>
+                <w:b/>
+              </w:rPr>
+              <w:t>0.821</w:t>
+            </w:r>
+          </w:p>
+        </w:tc>
       </w:tr>
       <w:tr>
         <w:tc>
           <w:tcPr>
-            <w:tcW w:type="dxa" w:w="3277"/>
+            <w:tcW w:type="dxa" w:w="2551"/>
           </w:tcPr>
           <w:p>
             <w:pPr>
@@ -982,7 +1085,7 @@
         </w:tc>
         <w:tc>
           <w:tcPr>
-            <w:tcW w:type="dxa" w:w="1272"/>
+            <w:tcW w:type="dxa" w:w="1077"/>
           </w:tcPr>
           <w:p>
             <w:pPr>
@@ -997,7 +1100,7 @@
         </w:tc>
         <w:tc>
           <w:tcPr>
-            <w:tcW w:type="dxa" w:w="1272"/>
+            <w:tcW w:type="dxa" w:w="680"/>
           </w:tcPr>
           <w:p>
             <w:pPr>
@@ -1012,7 +1115,7 @@
         </w:tc>
         <w:tc>
           <w:tcPr>
-            <w:tcW w:type="dxa" w:w="1272"/>
+            <w:tcW w:type="dxa" w:w="850"/>
           </w:tcPr>
           <w:p>
             <w:pPr>
@@ -1027,7 +1130,7 @@
         </w:tc>
         <w:tc>
           <w:tcPr>
-            <w:tcW w:type="dxa" w:w="1272"/>
+            <w:tcW w:type="dxa" w:w="1417"/>
           </w:tcPr>
           <w:p>
             <w:pPr>
@@ -1048,7 +1151,7 @@
         </w:tc>
         <w:tc>
           <w:tcPr>
-            <w:tcW w:type="dxa" w:w="1272"/>
+            <w:tcW w:type="dxa" w:w="1417"/>
           </w:tcPr>
           <w:p>
             <w:pPr>
@@ -1067,11 +1170,38 @@
             </w:r>
           </w:p>
         </w:tc>
+        <w:tc>
+          <w:tcPr>
+            <w:tcW w:type="dxa" w:w="1644"/>
+          </w:tcPr>
+          <w:p>
+            <w:pPr>
+              <w:pStyle w:val="tablecopy"/>
+              <w:spacing w:before="20" w:after="20"/>
+              <w:jc w:val="center"/>
+            </w:pPr>
+            <w:r>
+              <w:rPr>
+                <w:b/>
+              </w:rPr>
+              <w:t>0.851</w:t>
+            </w:r>
+            <w:r>
+              <w:t xml:space="preserve"> / </w:t>
+            </w:r>
+            <w:r>
+              <w:rPr>
+                <w:b/>
+              </w:rPr>
+              <w:t>0.817</w:t>
+            </w:r>
+          </w:p>
+        </w:tc>
       </w:tr>
       <w:tr>
         <w:tc>
           <w:tcPr>
-            <w:tcW w:type="dxa" w:w="3277"/>
+            <w:tcW w:type="dxa" w:w="2551"/>
           </w:tcPr>
           <w:p>
             <w:pPr>
@@ -1085,7 +1215,7 @@
         </w:tc>
         <w:tc>
           <w:tcPr>
-            <w:tcW w:type="dxa" w:w="1272"/>
+            <w:tcW w:type="dxa" w:w="1077"/>
           </w:tcPr>
           <w:p>
             <w:pPr>
@@ -1100,7 +1230,7 @@
         </w:tc>
         <w:tc>
           <w:tcPr>
-            <w:tcW w:type="dxa" w:w="1272"/>
+            <w:tcW w:type="dxa" w:w="680"/>
           </w:tcPr>
           <w:p>
             <w:pPr>
@@ -1115,7 +1245,7 @@
         </w:tc>
         <w:tc>
           <w:tcPr>
-            <w:tcW w:type="dxa" w:w="1272"/>
+            <w:tcW w:type="dxa" w:w="850"/>
           </w:tcPr>
           <w:p>
             <w:pPr>
@@ -1130,7 +1260,7 @@
         </w:tc>
         <w:tc>
           <w:tcPr>
-            <w:tcW w:type="dxa" w:w="1272"/>
+            <w:tcW w:type="dxa" w:w="1417"/>
           </w:tcPr>
           <w:p>
             <w:pPr>
@@ -1145,7 +1275,7 @@
         </w:tc>
         <w:tc>
           <w:tcPr>
-            <w:tcW w:type="dxa" w:w="1272"/>
+            <w:tcW w:type="dxa" w:w="1417"/>
           </w:tcPr>
           <w:p>
             <w:pPr>
@@ -1155,6 +1285,21 @@
             </w:pPr>
             <w:r>
               <w:t>28.66 / 28.68</w:t>
+            </w:r>
+          </w:p>
+        </w:tc>
+        <w:tc>
+          <w:tcPr>
+            <w:tcW w:type="dxa" w:w="1644"/>
+          </w:tcPr>
+          <w:p>
+            <w:pPr>
+              <w:pStyle w:val="tablecopy"/>
+              <w:spacing w:before="20" w:after="20"/>
+              <w:jc w:val="center"/>
+            </w:pPr>
+            <w:r>
+              <w:t>0.840 / 0.807</w:t>
             </w:r>
           </w:p>
         </w:tc>
@@ -1162,7 +1307,7 @@
       <w:tr>
         <w:tc>
           <w:tcPr>
-            <w:tcW w:type="dxa" w:w="3277"/>
+            <w:tcW w:type="dxa" w:w="2551"/>
           </w:tcPr>
           <w:p>
             <w:pPr>
@@ -1176,7 +1321,7 @@
         </w:tc>
         <w:tc>
           <w:tcPr>
-            <w:tcW w:type="dxa" w:w="1272"/>
+            <w:tcW w:type="dxa" w:w="1077"/>
           </w:tcPr>
           <w:p>
             <w:pPr>
@@ -1191,7 +1336,7 @@
         </w:tc>
         <w:tc>
           <w:tcPr>
-            <w:tcW w:type="dxa" w:w="1272"/>
+            <w:tcW w:type="dxa" w:w="680"/>
           </w:tcPr>
           <w:p>
             <w:pPr>
@@ -1206,7 +1351,7 @@
         </w:tc>
         <w:tc>
           <w:tcPr>
-            <w:tcW w:type="dxa" w:w="1272"/>
+            <w:tcW w:type="dxa" w:w="850"/>
           </w:tcPr>
           <w:p>
             <w:pPr>
@@ -1221,7 +1366,7 @@
         </w:tc>
         <w:tc>
           <w:tcPr>
-            <w:tcW w:type="dxa" w:w="1272"/>
+            <w:tcW w:type="dxa" w:w="1417"/>
           </w:tcPr>
           <w:p>
             <w:pPr>
@@ -1236,7 +1381,22 @@
         </w:tc>
         <w:tc>
           <w:tcPr>
-            <w:tcW w:type="dxa" w:w="1272"/>
+            <w:tcW w:type="dxa" w:w="1417"/>
+          </w:tcPr>
+          <w:p>
+            <w:pPr>
+              <w:pStyle w:val="tablecopy"/>
+              <w:spacing w:before="20" w:after="20"/>
+              <w:jc w:val="center"/>
+            </w:pPr>
+            <w:r>
+              <w:t>—</w:t>
+            </w:r>
+          </w:p>
+        </w:tc>
+        <w:tc>
+          <w:tcPr>
+            <w:tcW w:type="dxa" w:w="1644"/>
           </w:tcPr>
           <w:p>
             <w:pPr>
@@ -1300,7 +1460,7 @@
         </w:numPr>
       </w:pPr>
       <w:r>
-        <w:t>Fig. 2. Integer PSNR against core cycles per pixel (left Set12, right BSD68). Filled markers are board-measured cycles; B-32 points are seed 1. At about 670 cycles maxout lies above ReLU, and with QAT above A, while ReLU lies below A; B lies above and to the left of A.</w:t>
+        <w:t>Fig. 2. Integer PSNR against core cycles per pixel (left Set12, right BSD68). Filled markers are board-measured cycles; B-32 points are seed 1.</w:t>
       </w:r>
     </w:p>
     <w:p>
@@ -1340,7 +1500,7 @@
         <w:t>Speed model.</w:t>
       </w:r>
       <w:r>
-        <w:t xml:space="preserve"> B-32 + maxout + QAT needs 2.63× fewer cycles than A and scores 30.00 / 28.94 dB, +0.17 / +0.14 dB above A: level with BM3D on Set12 (9/12 images) and +0.57 dB on BSD68 (+0.32 dB unclipped).</w:t>
+        <w:t xml:space="preserve"> B-32 + maxout + QAT needs 2.63× fewer cycles than A and scores 30.00 / 28.94 dB, +0.17 / +0.14 dB above A: level with BM3D on Set12 in PSNR (9/12 images) and SSIM, and +0.57 dB on BSD68 (+0.32 dB unclipped).</w:t>
       </w:r>
     </w:p>
     <w:p>
@@ -1354,7 +1514,7 @@
         <w:t>Free channels against ReLU, and max against mean.</w:t>
       </w:r>
       <w:r>
-        <w:t xml:space="preserve"> At the same budget, the maxout network scores +0.37 / +0.26 dB above the ReLU network on all 80 images for 1.01× the board cycles (seed 1; image-paired standard error 0.04 / 0.02 dB, so the training run is the uncertainty). The averaging control matched maxout (validation +0.02 dB in float [AVG]), so in this seed the max adds nothing beyond the extra outputs. The ReLU run collapsed once, at epoch 26, and its validation-driven schedule halved the rate four times while it recovered; before that the three networks were level, so seeds 2 and 3 decide whether the gap holds and how large it is [SEEDS].</w:t>
+        <w:t xml:space="preserve"> At the same budget, the maxout network scores +0.37 / +0.26 dB (SSIM +0.011 / +0.011) above the ReLU network on all 80 images for 1.01× the board cycles (seed 1; image-paired standard error 0.04 / 0.02 dB, so the training run is the uncertainty). The averaging control matched maxout (validation +0.02 dB in float [AVG]), so in this seed the max adds nothing beyond the extra outputs. The ReLU run collapsed once, at epoch 26, and its validation-driven schedule halved the rate four times while it recovered; before that the three networks were level, so seeds 2 and 3 decide whether the gap holds and how large it is [SEEDS].</w:t>
       </w:r>
     </w:p>
     <w:p>
@@ -1368,7 +1528,7 @@
         <w:t>Quantization and the same-input reference.</w:t>
       </w:r>
       <w:r>
-        <w:t xml:space="preserve"> QAT brought every integer model within 0.04 dB of its float model; the maxout network had lost 0.16 / 0.14 dB before it. On the same input DnCNN-S (556k, float) is 0.2 dB above our 300k integer model on Set12; its BSD68 deficit reflects training on unclipped noise.</w:t>
+        <w:t xml:space="preserve"> QAT brought every integer model within 0.04 dB of its float model (maxout had lost 0.16 / 0.14 dB). On the same input DnCNN-S (556k, float) beats our 300k integer model by 0.2 dB on Set12 and in SSIM on both sets (by 0.001 on BSD68); its BSD68 PSNR deficit reflects training on unclipped noise.</w:t>
       </w:r>
     </w:p>
     <w:p>
@@ -1382,7 +1542,7 @@
         <w:t>Board.</w:t>
       </w:r>
       <w:r>
-        <w:t xml:space="preserve"> The maxout layers (K = 288, 64 outputs) took 289 cycles per window, exactly as the 32-output layers of A and of the ReLU network: doubling the outputs cost nothing on the board, and the whole network took 1.01× the ReLU network's cycles (Table II). Absolute throughput is low: 6.4 GOPS at most at 50 MHz and 0.9–2.3 s of core time per 256×256 image, against 30–38 ms for float PyTorch on a 4-core PC CPU. The JTAG test harness dominates wall-clock time, and the on-chip ARM was not compared; this paper concerns choosing networks for a given core.</w:t>
+        <w:t xml:space="preserve"> The maxout layers (K = 288, 64 outputs) took 289 cycles per window, exactly as the 32-output layers of A and of the ReLU network: doubling the outputs cost nothing on the board (Table II). Absolute throughput is low: 6.4 GOPS at most at 50 MHz and 0.9–2.3 s of core time per 256×256 image, against 30–38 ms for float PyTorch on a 4-core PC CPU. The JTAG test harness dominates wall-clock time, and the on-chip ARM was not compared; this paper concerns choosing networks for a given core.</w:t>
       </w:r>
     </w:p>
     <w:p>
@@ -1394,7 +1554,7 @@
         </w:numPr>
       </w:pPr>
       <w:r>
-        <w:t>Table II. Board runs (Set12 05.png, 256×256, 50 MHz, no mismatch in any layer). Cycles per window: model → board; B-32 networks with QAT; three earlier versions also matched. Core time: 2.33, 1.73, 0.89 and 0.88 s.</w:t>
+        <w:t>Table II. Board runs (Set12 05.png, 256×256, 50 MHz, no mismatch in any layer). Cycles per window: model → board; B-32 networks with QAT; three earlier versions also matched.</w:t>
       </w:r>
     </w:p>
     <w:tbl>
@@ -1409,15 +1569,15 @@
         <w:tblLook w:firstColumn="1" w:firstRow="1" w:lastColumn="0" w:lastRow="0" w:noHBand="0" w:noVBand="1" w:val="04A0"/>
       </w:tblPr>
       <w:tblGrid>
-        <w:gridCol w:w="1429"/>
-        <w:gridCol w:w="1111"/>
-        <w:gridCol w:w="1111"/>
-        <w:gridCol w:w="1111"/>
+        <w:gridCol w:w="1191"/>
+        <w:gridCol w:w="1587"/>
+        <w:gridCol w:w="1247"/>
+        <w:gridCol w:w="737"/>
       </w:tblGrid>
       <w:tr>
         <w:tc>
           <w:tcPr>
-            <w:tcW w:type="dxa" w:w="1429"/>
+            <w:tcW w:type="dxa" w:w="1191"/>
           </w:tcPr>
           <w:p>
             <w:pPr>
@@ -1431,7 +1591,7 @@
         </w:tc>
         <w:tc>
           <w:tcPr>
-            <w:tcW w:type="dxa" w:w="1111"/>
+            <w:tcW w:type="dxa" w:w="1587"/>
           </w:tcPr>
           <w:p>
             <w:pPr>
@@ -1446,7 +1606,7 @@
         </w:tc>
         <w:tc>
           <w:tcPr>
-            <w:tcW w:type="dxa" w:w="1111"/>
+            <w:tcW w:type="dxa" w:w="1247"/>
           </w:tcPr>
           <w:p>
             <w:pPr>
@@ -1461,7 +1621,7 @@
         </w:tc>
         <w:tc>
           <w:tcPr>
-            <w:tcW w:type="dxa" w:w="1111"/>
+            <w:tcW w:type="dxa" w:w="737"/>
           </w:tcPr>
           <w:p>
             <w:pPr>
@@ -1478,7 +1638,7 @@
       <w:tr>
         <w:tc>
           <w:tcPr>
-            <w:tcW w:type="dxa" w:w="1429"/>
+            <w:tcW w:type="dxa" w:w="1191"/>
           </w:tcPr>
           <w:p>
             <w:pPr>
@@ -1492,7 +1652,7 @@
         </w:tc>
         <w:tc>
           <w:tcPr>
-            <w:tcW w:type="dxa" w:w="1111"/>
+            <w:tcW w:type="dxa" w:w="1587"/>
           </w:tcPr>
           <w:p>
             <w:pPr>
@@ -1507,7 +1667,7 @@
         </w:tc>
         <w:tc>
           <w:tcPr>
-            <w:tcW w:type="dxa" w:w="1111"/>
+            <w:tcW w:type="dxa" w:w="1247"/>
           </w:tcPr>
           <w:p>
             <w:pPr>
@@ -1522,7 +1682,7 @@
         </w:tc>
         <w:tc>
           <w:tcPr>
-            <w:tcW w:type="dxa" w:w="1111"/>
+            <w:tcW w:type="dxa" w:w="737"/>
           </w:tcPr>
           <w:p>
             <w:pPr>
@@ -1539,7 +1699,7 @@
       <w:tr>
         <w:tc>
           <w:tcPr>
-            <w:tcW w:type="dxa" w:w="1429"/>
+            <w:tcW w:type="dxa" w:w="1191"/>
           </w:tcPr>
           <w:p>
             <w:pPr>
@@ -1553,7 +1713,7 @@
         </w:tc>
         <w:tc>
           <w:tcPr>
-            <w:tcW w:type="dxa" w:w="1111"/>
+            <w:tcW w:type="dxa" w:w="1587"/>
           </w:tcPr>
           <w:p>
             <w:pPr>
@@ -1568,7 +1728,7 @@
         </w:tc>
         <w:tc>
           <w:tcPr>
-            <w:tcW w:type="dxa" w:w="1111"/>
+            <w:tcW w:type="dxa" w:w="1247"/>
           </w:tcPr>
           <w:p>
             <w:pPr>
@@ -1583,7 +1743,7 @@
         </w:tc>
         <w:tc>
           <w:tcPr>
-            <w:tcW w:type="dxa" w:w="1111"/>
+            <w:tcW w:type="dxa" w:w="737"/>
           </w:tcPr>
           <w:p>
             <w:pPr>
@@ -1600,7 +1760,7 @@
       <w:tr>
         <w:tc>
           <w:tcPr>
-            <w:tcW w:type="dxa" w:w="1429"/>
+            <w:tcW w:type="dxa" w:w="1191"/>
           </w:tcPr>
           <w:p>
             <w:pPr>
@@ -1614,7 +1774,7 @@
         </w:tc>
         <w:tc>
           <w:tcPr>
-            <w:tcW w:type="dxa" w:w="1111"/>
+            <w:tcW w:type="dxa" w:w="1587"/>
           </w:tcPr>
           <w:p>
             <w:pPr>
@@ -1635,7 +1795,7 @@
         </w:tc>
         <w:tc>
           <w:tcPr>
-            <w:tcW w:type="dxa" w:w="1111"/>
+            <w:tcW w:type="dxa" w:w="1247"/>
           </w:tcPr>
           <w:p>
             <w:pPr>
@@ -1656,7 +1816,7 @@
         </w:tc>
         <w:tc>
           <w:tcPr>
-            <w:tcW w:type="dxa" w:w="1111"/>
+            <w:tcW w:type="dxa" w:w="737"/>
           </w:tcPr>
           <w:p>
             <w:pPr>
@@ -1673,7 +1833,7 @@
       <w:tr>
         <w:tc>
           <w:tcPr>
-            <w:tcW w:type="dxa" w:w="1429"/>
+            <w:tcW w:type="dxa" w:w="1191"/>
           </w:tcPr>
           <w:p>
             <w:pPr>
@@ -1687,7 +1847,7 @@
         </w:tc>
         <w:tc>
           <w:tcPr>
-            <w:tcW w:type="dxa" w:w="1111"/>
+            <w:tcW w:type="dxa" w:w="1587"/>
           </w:tcPr>
           <w:p>
             <w:pPr>
@@ -1702,7 +1862,7 @@
         </w:tc>
         <w:tc>
           <w:tcPr>
-            <w:tcW w:type="dxa" w:w="1111"/>
+            <w:tcW w:type="dxa" w:w="1247"/>
           </w:tcPr>
           <w:p>
             <w:pPr>
@@ -1717,7 +1877,7 @@
         </w:tc>
         <w:tc>
           <w:tcPr>
-            <w:tcW w:type="dxa" w:w="1111"/>
+            <w:tcW w:type="dxa" w:w="737"/>
           </w:tcPr>
           <w:p>
             <w:pPr>
@@ -1745,7 +1905,7 @@
         <w:pStyle w:val="a3"/>
       </w:pPr>
       <w:r>
-        <w:t>On a 64-multiplier integer core, a cycle model that matches the board showed that the bottleneck is the input port, not the multipliers, and two choices that look wasteful by FLOP count paid off: space-to-depth fitted a 6.4× larger network into 25% fewer cycles, and doubling the hidden outputs and pooling them in pairs doubled the parameters for 1% more cycles and denoised better, by max and, in one seed, by mean alike [SEEDS] [AVG]. These rules belong to an input structure fed by host-built windows, but the test behind them should carry over: by the cycle model about P·T/w output channels are free, so pooling 64 outputs would again be free on a core of this organization with 256 multipliers fed four values per cycle, and would not be on this core at two. EfficientNet-X [5], HALP [12] and DRACO [13], whose fastest network depends on the array size, apply the same logic on TPUs, GPUs and systolic arrays. Whether P·T/w holds for other input structures is still a prediction; we will measure wider ports and line buffers on the board next. Pooling is free in cycles only: in sparse mode it issued 3.0× the ReLU network's nonzero multiplications. Energy, end-to-end time without the test harness, other noise levels, color images and SSIM are not reported. Code, models, per-image PSNR and board logs are in the repository.</w:t>
+        <w:t>On a 64-multiplier integer core, a cycle model that matches the board showed that the bottleneck is the input port, not the multipliers, and two choices that look wasteful by FLOP count paid off: space-to-depth fitted a 6.4× larger network into 25% fewer cycles, and doubling the hidden outputs and pooling them in pairs doubled the parameters for 1% more cycles and denoised better, by max and, in one seed, by mean alike [SEEDS] [AVG]. These rules belong to an input structure fed by host-built windows, but the test behind them should carry over: by the cycle model about P·T/w output channels are free, so pooling 64 outputs would again be free on a core of this organization with 256 multipliers fed four values per cycle, and would not be on this core at two. EfficientNet-X [5], HALP [12] and DRACO [13], whose fastest network depends on the array size, apply the same logic on TPUs, GPUs and systolic arrays. Whether P·T/w holds for other input structures is a prediction, to be measured next on wider ports and line buffers. Pooling is free in cycles only: in sparse mode it issued 3.0× the ReLU network's nonzero multiplications. Energy, end-to-end time without the test harness, other noise levels and color images are not reported. Code, models, per-image PSNR and board logs are in the repository.</w:t>
       </w:r>
     </w:p>
     <w:p>
@@ -2141,6 +2301,23 @@
       </w:r>
       <w:r>
         <w:t>, 2001.</w:t>
+      </w:r>
+    </w:p>
+    <w:p>
+      <w:pPr>
+        <w:pStyle w:val="references"/>
+      </w:pPr>
+      <w:r>
+        <w:t xml:space="preserve">Z. Wang, A. C. Bovik, H. R. Sheikh, and E. P. Simoncelli, "Image quality assessment: From error visibility to structural similarity," </w:t>
+      </w:r>
+      <w:r>
+        <w:rPr>
+          <w:i/>
+        </w:rPr>
+        <w:t>IEEE Trans. Image Process.</w:t>
+      </w:r>
+      <w:r>
+        <w:t>, vol. 13, no. 4, pp. 600–612, 2004.</w:t>
       </w:r>
     </w:p>
     <w:p>

</xml_diff>

<commit_message>
Papers: the four-value port measured on the board
The W=4 board runs (0e6075d) matched the count committed before the
bitstream existed (7e81f6b) within 0.0009-0.0044% on all four networks,
with no mismatch; B/A went from 0.75 to 1.19 and maxout/ReLU from 1.01
to 2.48. The abstract, introduction, Section II, Table II, Section IV
and the conclusion now report the measurement instead of the RTL
simulation; w = 2 and line buffers stay predictions. The English Table II
trades its single-image PSNR column for the w = 4 cycles per pixel and
stays at four pages.

Co-Authored-By: Claude Opus 5.5 <noreply@anthropic.com>
Claude-Session: https://claude.ai/code/session_01KmQd2ww7ZkypMsRjhWuU5X
</commit_message>
<xml_diff>
--- a/iweict2026/PAPER_EN.docx
+++ b/iweict2026/PAPER_EN.docx
@@ -67,7 +67,7 @@
         <w:pStyle w:val="Abstract"/>
       </w:pPr>
       <w:r>
-        <w:t>Abstract—Efficient neural networks are usually designed to minimize multiplications, but on a small accelerator the run time may be set by something else. On our integer CNN core for a Zynq XC7Z020 FPGA (64 multipliers, 7-bit inputs), we show how the measured bottleneck changes the design of a Gaussian denoiser. A cycle model, corrected on earlier board runs and within 0.003% of the board on four networks, shows that this build, fed host-built windows one value per cycle, is bound by its input port: a window of K values costs K cycles for up to 64 output channels, so a DnCNN-style baseline leaves most multipliers idle. Two choices that look wasteful by FLOP count are therefore cheap. A 2×2 space-to-depth input fits a 6.4× larger network in 25% fewer cycles. Doubling the hidden outputs and pooling them in pairs (maxout) doubles the parameters for 1% more cycles. With quantization-aware training that reproduces the board's arithmetic, the quality model reaches 30.12 dB on Set12 (σ = 25), above BM3D on the same input, and the speed model matches BM3D in 2.63× fewer cycles than the baseline; four networks were verified bit for bit on the board, a full image each. The cycle model predicts that with two input values per cycle pooling stops being free, and with four (where RTL simulation of a four-value variant agrees on real windows) or with line buffers the 6.4× larger network becomes slower than the baseline: the network to choose follows the measured bottleneck.</w:t>
+        <w:t>Abstract—Efficient neural networks are usually designed to minimize multiplications, but on a small accelerator the run time may be set by something else. On our integer CNN core for a Zynq XC7Z020 FPGA (64 multipliers, 7-bit inputs), we show how the measured bottleneck changes the design of a Gaussian denoiser. A cycle model, corrected on earlier board runs and within 0.003% of the board on four networks, shows that this build, fed host-built windows one value per cycle, is bound by its input port: a window of K values costs K cycles for up to 64 output channels, so a DnCNN-style baseline leaves most multipliers idle. Two choices that look wasteful by FLOP count are therefore cheap. A 2×2 space-to-depth input fits a 6.4× larger network in 25% fewer cycles. Doubling the hidden outputs and pooling them in pairs (maxout) doubles the parameters for 1% more cycles. With quantization-aware training that reproduces the board's arithmetic, the quality model reaches 30.12 dB on Set12 (σ = 25), above BM3D on the same input, and the speed model matches BM3D in 2.63× fewer cycles than the baseline; four networks were verified bit for bit on the board, a full image each. The cycle model predicts that with two input values per cycle pooling stops being free, and with four (on a four-value variant the board matched it within 0.005%) or with line buffers the 6.4× larger network becomes slower than the baseline: the network to choose follows the measured bottleneck.</w:t>
       </w:r>
     </w:p>
     <w:p>
@@ -115,7 +115,7 @@
         <w:pStyle w:val="a3"/>
       </w:pPr>
       <w:r>
-        <w:t>Space-to-depth [14], [5], maxout [15]–[17] and quantization-aware training [18] are known techniques; our claim concerns the reason for choosing them. It holds for host-built windows fed one value per cycle; with four values per cycle (RTL-simulated) or on-chip line buffers (predicted) the same model gives different choices (Section II).</w:t>
+        <w:t>Space-to-depth [14], [5], maxout [15]–[17] and quantization-aware training [18] are known techniques; our claim concerns the reason for choosing them. It holds for host-built windows fed one value per cycle; with four values per cycle (measured) or on-chip line buffers (predicted) the same model gives different choices (Section II).</w:t>
       </w:r>
     </w:p>
     <w:p>
@@ -235,7 +235,7 @@
         <w:t>Where the bottleneck comes from.</w:t>
       </w:r>
       <w:r>
-        <w:t xml:space="preserve"> One value per cycle is a choice of this design, not a limit of the FPGA: the core's window port takes one value per cycle, and the AXI-Stream wrapper unpacks the four 7-bit values of each 32-bit beat to match it. We treat the core, built for CIFAR-10, as given, as a user of a fixed accelerator would. With w values per cycle, about P·T/w output channels come free. To test this we built a variant that takes a whole beat (w = 4) per cycle, one value per bank. Counting every window of a test image with the feed term ⌈K/w⌉ + 1 (sparse, as on the board), pooling costs 1.55× the ReLU network at w = 2 and 2.48× at w = 4, and B, still 0.82× A at w = 2, costs 1.19× A at w = 4 (by the dense bound, 1.87× and 1.37× already at w = 2). In RTL simulation of the w = 4 variant on 512 real windows of every layer, the outputs were exact and the cycles matched this count to within each layer's pipeline fill and drain (≤ 164), with a beat arriving every cycle; the variant has not yet run on the board. With on-chip line buffers [7], a window brings one new pixel, C_in values, giving 2.61× and 1.23×. w = 2 and line buffers remain predictions, and the rules below hold for this input structure. Host im2col, requantization and pooling take 0.07–0.13 s per image on a 4-core PC; on hidden layers the last two need fewer operations per window than K and could hide in hardware, while im2col would need line buffers.</w:t>
+        <w:t xml:space="preserve"> One value per cycle is a choice of this design, not a limit of the FPGA: the core's window port takes one value per cycle, and the AXI-Stream wrapper unpacks the four 7-bit values of each 32-bit beat to match it. We treat the core, built for CIFAR-10, as given, as a user of a fixed accelerator would. With w values per cycle, about P·T/w output channels come free. To test this we built a variant that takes a whole beat (w = 4) per cycle, one value per bank. Counting every window of a test image with the feed term ⌈K/w⌉ + 1 (sparse, as on the board), pooling costs 1.55× the ReLU network at w = 2 and 2.48× at w = 4, and B, still 0.82× A at w = 2, costs 1.19× A at w = 4 (by the dense bound, 1.87× and 1.37× already at w = 2). On the board (Table II; WNS +0.130 ns at 100 MHz), the w = 4 variant ran all four networks bit-exactly within 0.005% of this count, committed before the run; per layer the gap is the pipeline fill and drain (9–164 cycles), and the input stalled 12 cycles in all. With on-chip line buffers [7], a window brings one new pixel, C_in values, giving 2.61× and 1.23×. w = 2 and line buffers remain predictions, and the rules below hold for this input structure. Host im2col, requantization and pooling take 0.07–0.13 s per image on a 4-core PC; on hidden layers the last two need fewer operations per window than K and could hide in hardware, while im2col would need line buffers.</w:t>
       </w:r>
     </w:p>
     <w:p>
@@ -333,7 +333,7 @@
         <w:pStyle w:val="a3"/>
       </w:pPr>
       <w:r>
-        <w:t>The RTL was verified in a UVM [21] environment (protocol agents, a predicting scoreboard, coverage and assertions) on Verilator: 69 runs under UVM 1.2 and 46 under IEEE 1800.2-2020 on seven builds (three of them w = 4) passed, and all 15 injected bugs were caught. Shape coverage was 89–100% on a reduced build and 17–29% on the board build; the denoisers' hidden shapes are among its directed CIFAR-10 shapes, and their first and last layers on the board and in Section II's simulation. On the board every layer's output is compared value by value with the integer model; every board figure passed.</w:t>
+        <w:t>The RTL was verified in a UVM [21] environment (protocol agents, a predicting scoreboard, coverage and assertions) on Verilator: 69 runs under UVM 1.2 and 46 under IEEE 1800.2-2020 on seven builds (three of them w = 4) passed, and all 15 injected bugs were caught. Shape coverage was 89–100% on a reduced build and 17–29% on the board build; the denoisers' hidden shapes are among its directed CIFAR-10 shapes, and their first and last layers on the board, at w = 1 and 4. On the board every layer's output is compared value by value with the integer model; every board figure passed.</w:t>
       </w:r>
     </w:p>
     <w:p>
@@ -1663,7 +1663,7 @@
         </w:numPr>
       </w:pPr>
       <w:r>
-        <w:t>Table II. Board runs (Set12 05.png, 256×256, 50 MHz, no mismatch in any layer). Cycles per window: model → board; B-32 networks with QAT; three earlier versions also matched.</w:t>
+        <w:t>Table II. Board runs (Set12 05.png, 256×256, 50 MHz, no mismatch in any layer). Cycles per window: model → board; B-32 networks with QAT; three earlier versions also matched. w = 4: cycles per pixel.</w:t>
       </w:r>
     </w:p>
     <w:tbl>
@@ -1739,7 +1739,7 @@
               <w:jc w:val="center"/>
             </w:pPr>
             <w:r>
-              <w:t>PSNR</w:t>
+              <w:t>w = 4</w:t>
             </w:r>
           </w:p>
         </w:tc>
@@ -1800,7 +1800,7 @@
               <w:jc w:val="center"/>
             </w:pPr>
             <w:r>
-              <w:t>29.83</w:t>
+              <w:t>573</w:t>
             </w:r>
           </w:p>
         </w:tc>
@@ -1861,7 +1861,7 @@
               <w:jc w:val="center"/>
             </w:pPr>
             <w:r>
-              <w:t>30.06</w:t>
+              <w:t>683</w:t>
             </w:r>
           </w:p>
         </w:tc>
@@ -1934,7 +1934,7 @@
               <w:jc w:val="center"/>
             </w:pPr>
             <w:r>
-              <w:t>29.94</w:t>
+              <w:t>503</w:t>
             </w:r>
           </w:p>
         </w:tc>
@@ -1995,7 +1995,7 @@
               <w:jc w:val="center"/>
             </w:pPr>
             <w:r>
-              <w:t>29.54</w:t>
+              <w:t>203</w:t>
             </w:r>
           </w:p>
         </w:tc>
@@ -2014,7 +2014,7 @@
         <w:pStyle w:val="a3"/>
       </w:pPr>
       <w:r>
-        <w:t>On a 64-multiplier integer core, a cycle model that matches the board showed that the bottleneck is the input port, not the multipliers, and two choices that look wasteful by FLOP count became cheap: space-to-depth fitted a 6.4× larger network into 25% fewer cycles, and doubling the hidden outputs and pooling them in pairs doubled the parameters for 1% more cycles, though its gain over the same-width ReLU network did not hold in every seed. These rules belong to an input structure fed by host-built windows, but the test behind them should carry over: by the cycle model about P·T/w output channels are free, so pooling 64 outputs would again be free on a core of this organization with 256 multipliers fed four values per cycle, and would not be on this core at two. EfficientNet-X [5], HALP [12] and DRACO [13] apply the same logic on TPUs, GPUs and systolic arrays. On this core at w = 4, RTL simulation (not yet the board) agrees; elsewhere P·T/w is still a prediction. Pooling is free in cycles only: in sparse mode it issued 3.0× the ReLU network's nonzero multiplications. Energy, end-to-end time without the test harness, other noise levels and color images are not reported. Code, models and board logs are in the repository.</w:t>
+        <w:t>On a 64-multiplier integer core, a cycle model that matches the board showed that the bottleneck is the input port, not the multipliers, and two choices that look wasteful by FLOP count became cheap: space-to-depth fitted a 6.4× larger network into 25% fewer cycles, and doubling the hidden outputs and pooling them in pairs doubled the parameters for 1% more cycles, though its gain over the same-width ReLU network did not hold in every seed. These rules belong to an input structure fed by host-built windows, but the test behind them should carry over: by the cycle model about P·T/w output channels are free, so pooling 64 outputs would again be free on a core of this organization with 256 multipliers fed four values per cycle, and would not be on this core at two. EfficientNet-X [5], HALP [12] and DRACO [13] apply the same logic on TPUs, GPUs and systolic arrays. On this core at w = 4 the board matched the count behind it; elsewhere P·T/w is still a prediction. Pooling is free in cycles only: in sparse mode it issued 3.0× the ReLU network's nonzero multiplications. Energy, end-to-end time without the test harness, other noise levels and color images are not reported. Code, models and board logs are in the repository.</w:t>
       </w:r>
     </w:p>
     <w:p>

</xml_diff>